<commit_message>
updated code workflow + created MT_05 code for data post processing + created MT_06 code for data structure analysis and GAMs across different resolutions
</commit_message>
<xml_diff>
--- a/Workflow_Explanation.docx
+++ b/Workflow_Explanation.docx
@@ -57,16 +57,11 @@
         <w:t xml:space="preserve">In a multiple step process the canopy cover, land-use and PPGIS data is clipped to the administrative boundaries and 100m/200m buffered administrative boundaries of Helsinki and Copenhagen. </w:t>
       </w:r>
       <w:r>
-        <w:t xml:space="preserve">All resulting files are called </w:t>
-      </w:r>
-      <w:proofErr w:type="spellStart"/>
-      <w:r>
-        <w:t>Final_City_</w:t>
+        <w:t>All resulting files are called Final_City_</w:t>
       </w:r>
       <w:r>
         <w:t>Content</w:t>
       </w:r>
-      <w:proofErr w:type="spellEnd"/>
       <w:r>
         <w:t xml:space="preserve">. </w:t>
       </w:r>
@@ -74,6 +69,17 @@
     <w:p/>
     <w:p>
       <w:r>
+        <w:t>Urban Atlas: 2018 data</w:t>
+      </w:r>
+    </w:p>
+    <w:p>
+      <w:r>
+        <w:t>Canopy Cover: CLMS 2023 data (newest available at the time)</w:t>
+      </w:r>
+    </w:p>
+    <w:p/>
+    <w:p>
+      <w:r>
         <w:t>MT_03_UrbanAtlas_Reclassification.R</w:t>
       </w:r>
     </w:p>
@@ -130,17 +136,347 @@
     </w:p>
     <w:p>
       <w:r>
-        <w:t>Land covers can be assessed by first intersecting the grid with the urban atlas data, where the input is the land cover data and the overlay the g</w:t>
-      </w:r>
-      <w:r>
-        <w:t>ri</w:t>
-      </w:r>
-      <w:r>
-        <w:t xml:space="preserve">d. </w:t>
+        <w:t xml:space="preserve">Land covers can be assessed by intersecting the grid with the urban atlas data, </w:t>
+      </w:r>
+      <w:r>
+        <w:t>with land cover as</w:t>
+      </w:r>
+      <w:r>
+        <w:t xml:space="preserve"> the input and the </w:t>
+      </w:r>
+      <w:r>
+        <w:t xml:space="preserve">grid as the </w:t>
+      </w:r>
+      <w:r>
+        <w:t>overla</w:t>
+      </w:r>
+      <w:r>
+        <w:t>y</w:t>
+      </w:r>
+      <w:r>
+        <w:t xml:space="preserve">. </w:t>
+      </w:r>
+    </w:p>
+    <w:p>
+      <w:r>
+        <w:t xml:space="preserve">Create two datasets: The first to assess </w:t>
+      </w:r>
+      <w:r>
+        <w:t xml:space="preserve">(1) area per grid cell and (2) </w:t>
+      </w:r>
+      <w:r>
+        <w:t>land cover</w:t>
+      </w:r>
+      <w:r>
+        <w:t xml:space="preserve"> within each grid cell</w:t>
+      </w:r>
+      <w:r>
+        <w:t xml:space="preserve">. The second </w:t>
+      </w:r>
+      <w:r>
+        <w:t>is to</w:t>
+      </w:r>
+      <w:r>
+        <w:t xml:space="preserve"> assess </w:t>
+      </w:r>
+      <w:r>
+        <w:t xml:space="preserve">(1) </w:t>
+      </w:r>
+      <w:r>
+        <w:t>canopy cover per grid cell and</w:t>
+      </w:r>
+      <w:r>
+        <w:t xml:space="preserve"> (2)</w:t>
+      </w:r>
+      <w:r>
+        <w:t xml:space="preserve"> social value counts per grid cell</w:t>
+      </w:r>
+      <w:r>
+        <w:t>.</w:t>
+      </w:r>
+    </w:p>
+    <w:p>
+      <w:r>
+        <w:lastRenderedPageBreak/>
+        <w:t xml:space="preserve">This is </w:t>
+      </w:r>
+      <w:r>
+        <w:rPr>
+          <w:b/>
+          <w:bCs/>
+        </w:rPr>
+        <w:t>done for the 100m buffered administrative boundaries</w:t>
+      </w:r>
+      <w:r>
+        <w:rPr>
+          <w:b/>
+          <w:bCs/>
+        </w:rPr>
+        <w:t xml:space="preserve"> </w:t>
+      </w:r>
+      <w:r>
+        <w:t>to account for mapping imprecisions</w:t>
+      </w:r>
+      <w:r>
+        <w:t xml:space="preserve"> in the PPGIS</w:t>
+      </w:r>
+      <w:r>
+        <w:t>.</w:t>
       </w:r>
     </w:p>
     <w:p/>
     <w:p/>
+    <w:p>
+      <w:r>
+        <w:t>MT_05_Grid Post Processing</w:t>
+      </w:r>
+    </w:p>
+    <w:p>
+      <w:r>
+        <w:t xml:space="preserve">Aggregate land cover data within each grid cell. The initial .shp-data contains separate rows for the same land cover within some grid cells as it is based on the Urban Atlas 2018 polygons. </w:t>
+      </w:r>
+      <w:r>
+        <w:t xml:space="preserve">Then calculate the share of a given land use within a grid cell. Lastly, pivot the land cover data wider to create a wide table. </w:t>
+      </w:r>
+    </w:p>
+    <w:p>
+      <w:r>
+        <w:t>Then combine both the wide land cover data with the canopy cover and social values data based on the grid cell id.</w:t>
+      </w:r>
+    </w:p>
+    <w:p>
+      <w:r>
+        <w:t xml:space="preserve">The final result is saved as </w:t>
+      </w:r>
+      <w:r>
+        <w:t>a .gpkg</w:t>
+      </w:r>
+      <w:r>
+        <w:t xml:space="preserve"> and .csv for further use.</w:t>
+      </w:r>
+    </w:p>
+    <w:p/>
+    <w:p>
+      <w:r>
+        <w:t>This code is based on two loop functions.</w:t>
+      </w:r>
+    </w:p>
+    <w:p/>
+    <w:p>
+      <w:r>
+        <w:t>Two approaches for grid based assessment:</w:t>
+      </w:r>
+    </w:p>
+    <w:p>
+      <w:pPr>
+        <w:pStyle w:val="ListParagraph"/>
+        <w:numPr>
+          <w:ilvl w:val="0"/>
+          <w:numId w:val="1"/>
+        </w:numPr>
+      </w:pPr>
+      <w:r>
+        <w:t>Grid exactly clipped to administrative boundaries (or the 100m buffered version of it)</w:t>
+      </w:r>
+    </w:p>
+    <w:p>
+      <w:pPr>
+        <w:pStyle w:val="ListParagraph"/>
+        <w:numPr>
+          <w:ilvl w:val="1"/>
+          <w:numId w:val="1"/>
+        </w:numPr>
+      </w:pPr>
+      <w:r>
+        <w:t>Pros: Accurate study area</w:t>
+      </w:r>
+    </w:p>
+    <w:p>
+      <w:pPr>
+        <w:pStyle w:val="ListParagraph"/>
+        <w:numPr>
+          <w:ilvl w:val="1"/>
+          <w:numId w:val="1"/>
+        </w:numPr>
+      </w:pPr>
+      <w:r>
+        <w:t xml:space="preserve">Cons: Inconsistent grid </w:t>
+      </w:r>
+      <w:r>
+        <w:t xml:space="preserve">cell </w:t>
+      </w:r>
+      <w:r>
+        <w:t>size on the edges</w:t>
+      </w:r>
+    </w:p>
+    <w:p>
+      <w:pPr>
+        <w:pStyle w:val="ListParagraph"/>
+        <w:numPr>
+          <w:ilvl w:val="0"/>
+          <w:numId w:val="1"/>
+        </w:numPr>
+      </w:pPr>
+      <w:r>
+        <w:t>Grid clipped based on centroids location to administrative boundaries</w:t>
+      </w:r>
+    </w:p>
+    <w:p>
+      <w:pPr>
+        <w:pStyle w:val="ListParagraph"/>
+        <w:numPr>
+          <w:ilvl w:val="1"/>
+          <w:numId w:val="1"/>
+        </w:numPr>
+      </w:pPr>
+      <w:r>
+        <w:t>Pros: Full cell size for all grid cells</w:t>
+      </w:r>
+    </w:p>
+    <w:p>
+      <w:pPr>
+        <w:pStyle w:val="ListParagraph"/>
+        <w:numPr>
+          <w:ilvl w:val="1"/>
+          <w:numId w:val="1"/>
+        </w:numPr>
+      </w:pPr>
+      <w:r>
+        <w:t>Cons: Approximation of area dependent on grid cell size + loss of some observations dependent on buffer chosen</w:t>
+      </w:r>
+    </w:p>
+    <w:p/>
+    <w:p>
+      <w:r>
+        <w:t>How to approach 2:</w:t>
+      </w:r>
+    </w:p>
+    <w:p>
+      <w:pPr>
+        <w:pStyle w:val="ListParagraph"/>
+        <w:numPr>
+          <w:ilvl w:val="0"/>
+          <w:numId w:val="2"/>
+        </w:numPr>
+      </w:pPr>
+      <w:r>
+        <w:t>Create grid</w:t>
+      </w:r>
+      <w:r>
+        <w:t xml:space="preserve"> (</w:t>
+      </w:r>
+      <w:r>
+        <w:rPr>
+          <w:i/>
+          <w:iCs/>
+        </w:rPr>
+        <w:t>Vector -&gt; Research Tools -&gt; Create Grid</w:t>
+      </w:r>
+      <w:r>
+        <w:t>)</w:t>
+      </w:r>
+    </w:p>
+    <w:p>
+      <w:pPr>
+        <w:pStyle w:val="ListParagraph"/>
+        <w:numPr>
+          <w:ilvl w:val="0"/>
+          <w:numId w:val="2"/>
+        </w:numPr>
+      </w:pPr>
+      <w:r>
+        <w:t>Create centroids (</w:t>
+      </w:r>
+      <w:r>
+        <w:rPr>
+          <w:i/>
+          <w:iCs/>
+        </w:rPr>
+        <w:t>Vector -&gt; Geometry Tools -&gt; Centroids</w:t>
+      </w:r>
+      <w:r>
+        <w:t>)</w:t>
+      </w:r>
+    </w:p>
+    <w:p>
+      <w:pPr>
+        <w:pStyle w:val="ListParagraph"/>
+        <w:numPr>
+          <w:ilvl w:val="0"/>
+          <w:numId w:val="2"/>
+        </w:numPr>
+      </w:pPr>
+      <w:r>
+        <w:t>Clip centroids to respective area (</w:t>
+      </w:r>
+      <w:r>
+        <w:rPr>
+          <w:i/>
+          <w:iCs/>
+        </w:rPr>
+        <w:t>Vector -&gt; Geoprocessing Tools -&gt; Clip</w:t>
+      </w:r>
+      <w:r>
+        <w:t>)</w:t>
+      </w:r>
+    </w:p>
+    <w:p>
+      <w:pPr>
+        <w:pStyle w:val="ListParagraph"/>
+        <w:numPr>
+          <w:ilvl w:val="0"/>
+          <w:numId w:val="2"/>
+        </w:numPr>
+      </w:pPr>
+      <w:r>
+        <w:t>Create square buffer around clipped centroids (</w:t>
+      </w:r>
+      <w:r>
+        <w:rPr>
+          <w:i/>
+          <w:iCs/>
+        </w:rPr>
+        <w:t>Vector -&gt; Geoprocessing Tools -&gt; Buffer</w:t>
+      </w:r>
+      <w:r>
+        <w:t>) with radius half of the intended grid cell size and square features and buffer edges</w:t>
+      </w:r>
+    </w:p>
+    <w:p/>
+    <w:p/>
+    <w:p/>
+    <w:p>
+      <w:r>
+        <w:t>MT_06_</w:t>
+      </w:r>
+      <w:r>
+        <w:t>Sensitivity Analysis</w:t>
+      </w:r>
+      <w:r>
+        <w:t xml:space="preserve"> </w:t>
+      </w:r>
+    </w:p>
+    <w:p>
+      <w:r>
+        <w:t xml:space="preserve">Uses data from MT_05. </w:t>
+      </w:r>
+    </w:p>
+    <w:p>
+      <w:r>
+        <w:t>First investigates data structure across different resolutions</w:t>
+      </w:r>
+      <w:r>
+        <w:t>.</w:t>
+      </w:r>
+    </w:p>
+    <w:p>
+      <w:r>
+        <w:t xml:space="preserve">Then </w:t>
+      </w:r>
+      <w:r>
+        <w:t>creates GLMs and GAMs for different resolutions</w:t>
+      </w:r>
+    </w:p>
     <w:p/>
     <w:sectPr>
       <w:pgSz w:w="11906" w:h="16838"/>
@@ -150,6 +486,195 @@
     </w:sectPr>
   </w:body>
 </w:document>
+</file>
+
+<file path=word/numbering.xml><?xml version="1.0" encoding="utf-8"?>
+<w:numbering xmlns:wpc="http://schemas.microsoft.com/office/word/2010/wordprocessingCanvas" xmlns:cx="http://schemas.microsoft.com/office/drawing/2014/chartex" xmlns:cx1="http://schemas.microsoft.com/office/drawing/2015/9/8/chartex" xmlns:cx2="http://schemas.microsoft.com/office/drawing/2015/10/21/chartex" xmlns:cx3="http://schemas.microsoft.com/office/drawing/2016/5/9/chartex" xmlns:cx4="http://schemas.microsoft.com/office/drawing/2016/5/10/chartex" xmlns:cx5="http://schemas.microsoft.com/office/drawing/2016/5/11/chartex" xmlns:cx6="http://schemas.microsoft.com/office/drawing/2016/5/12/chartex" xmlns:cx7="http://schemas.microsoft.com/office/drawing/2016/5/13/chartex" xmlns:cx8="http://schemas.microsoft.com/office/drawing/2016/5/14/chartex" xmlns:mc="http://schemas.openxmlformats.org/markup-compatibility/2006" xmlns:aink="http://schemas.microsoft.com/office/drawing/2016/ink" xmlns:am3d="http://schemas.microsoft.com/office/drawing/2017/model3d" xmlns:o="urn:schemas-microsoft-com:office:office" xmlns:oel="http://schemas.microsoft.com/office/2019/extlst" xmlns:r="http://schemas.openxmlformats.org/officeDocument/2006/relationships" xmlns:m="http://schemas.openxmlformats.org/officeDocument/2006/math" xmlns:v="urn:schemas-microsoft-com:vml" xmlns:wp14="http://schemas.microsoft.com/office/word/2010/wordprocessingDrawing" xmlns:wp="http://schemas.openxmlformats.org/drawingml/2006/wordprocessingDrawing" xmlns:w10="urn:schemas-microsoft-com:office:word" xmlns:w="http://schemas.openxmlformats.org/wordprocessingml/2006/main" xmlns:w14="http://schemas.microsoft.com/office/word/2010/wordml" xmlns:w15="http://schemas.microsoft.com/office/word/2012/wordml" xmlns:w16cex="http://schemas.microsoft.com/office/word/2018/wordml/cex" xmlns:w16cid="http://schemas.microsoft.com/office/word/2016/wordml/cid" xmlns:w16="http://schemas.microsoft.com/office/word/2018/wordml" xmlns:w16du="http://schemas.microsoft.com/office/word/2023/wordml/word16du" xmlns:w16sdtdh="http://schemas.microsoft.com/office/word/2020/wordml/sdtdatahash" xmlns:w16sdtfl="http://schemas.microsoft.com/office/word/2024/wordml/sdtformatlock" xmlns:w16se="http://schemas.microsoft.com/office/word/2015/wordml/symex" xmlns:wpg="http://schemas.microsoft.com/office/word/2010/wordprocessingGroup" xmlns:wpi="http://schemas.microsoft.com/office/word/2010/wordprocessingInk" xmlns:wne="http://schemas.microsoft.com/office/word/2006/wordml" xmlns:wps="http://schemas.microsoft.com/office/word/2010/wordprocessingShape" mc:Ignorable="w14 w15 w16se w16cid w16 w16cex w16sdtdh w16sdtfl w16du wp14">
+  <w:abstractNum w:abstractNumId="0" w15:restartNumberingAfterBreak="0">
+    <w:nsid w:val="0A4C3575"/>
+    <w:multiLevelType w:val="hybridMultilevel"/>
+    <w:tmpl w:val="87042704"/>
+    <w:lvl w:ilvl="0" w:tplc="0409000F">
+      <w:start w:val="1"/>
+      <w:numFmt w:val="decimal"/>
+      <w:lvlText w:val="%1."/>
+      <w:lvlJc w:val="left"/>
+      <w:pPr>
+        <w:ind w:left="720" w:hanging="360"/>
+      </w:pPr>
+      <w:rPr>
+        <w:rFonts w:hint="default"/>
+      </w:rPr>
+    </w:lvl>
+    <w:lvl w:ilvl="1" w:tplc="04090019" w:tentative="1">
+      <w:start w:val="1"/>
+      <w:numFmt w:val="lowerLetter"/>
+      <w:lvlText w:val="%2."/>
+      <w:lvlJc w:val="left"/>
+      <w:pPr>
+        <w:ind w:left="1440" w:hanging="360"/>
+      </w:pPr>
+    </w:lvl>
+    <w:lvl w:ilvl="2" w:tplc="0409001B" w:tentative="1">
+      <w:start w:val="1"/>
+      <w:numFmt w:val="lowerRoman"/>
+      <w:lvlText w:val="%3."/>
+      <w:lvlJc w:val="right"/>
+      <w:pPr>
+        <w:ind w:left="2160" w:hanging="180"/>
+      </w:pPr>
+    </w:lvl>
+    <w:lvl w:ilvl="3" w:tplc="0409000F" w:tentative="1">
+      <w:start w:val="1"/>
+      <w:numFmt w:val="decimal"/>
+      <w:lvlText w:val="%4."/>
+      <w:lvlJc w:val="left"/>
+      <w:pPr>
+        <w:ind w:left="2880" w:hanging="360"/>
+      </w:pPr>
+    </w:lvl>
+    <w:lvl w:ilvl="4" w:tplc="04090019" w:tentative="1">
+      <w:start w:val="1"/>
+      <w:numFmt w:val="lowerLetter"/>
+      <w:lvlText w:val="%5."/>
+      <w:lvlJc w:val="left"/>
+      <w:pPr>
+        <w:ind w:left="3600" w:hanging="360"/>
+      </w:pPr>
+    </w:lvl>
+    <w:lvl w:ilvl="5" w:tplc="0409001B" w:tentative="1">
+      <w:start w:val="1"/>
+      <w:numFmt w:val="lowerRoman"/>
+      <w:lvlText w:val="%6."/>
+      <w:lvlJc w:val="right"/>
+      <w:pPr>
+        <w:ind w:left="4320" w:hanging="180"/>
+      </w:pPr>
+    </w:lvl>
+    <w:lvl w:ilvl="6" w:tplc="0409000F" w:tentative="1">
+      <w:start w:val="1"/>
+      <w:numFmt w:val="decimal"/>
+      <w:lvlText w:val="%7."/>
+      <w:lvlJc w:val="left"/>
+      <w:pPr>
+        <w:ind w:left="5040" w:hanging="360"/>
+      </w:pPr>
+    </w:lvl>
+    <w:lvl w:ilvl="7" w:tplc="04090019" w:tentative="1">
+      <w:start w:val="1"/>
+      <w:numFmt w:val="lowerLetter"/>
+      <w:lvlText w:val="%8."/>
+      <w:lvlJc w:val="left"/>
+      <w:pPr>
+        <w:ind w:left="5760" w:hanging="360"/>
+      </w:pPr>
+    </w:lvl>
+    <w:lvl w:ilvl="8" w:tplc="0409001B" w:tentative="1">
+      <w:start w:val="1"/>
+      <w:numFmt w:val="lowerRoman"/>
+      <w:lvlText w:val="%9."/>
+      <w:lvlJc w:val="right"/>
+      <w:pPr>
+        <w:ind w:left="6480" w:hanging="180"/>
+      </w:pPr>
+    </w:lvl>
+  </w:abstractNum>
+  <w:abstractNum w:abstractNumId="1" w15:restartNumberingAfterBreak="0">
+    <w:nsid w:val="33FA39A7"/>
+    <w:multiLevelType w:val="hybridMultilevel"/>
+    <w:tmpl w:val="7430B8F0"/>
+    <w:lvl w:ilvl="0" w:tplc="0409000F">
+      <w:start w:val="1"/>
+      <w:numFmt w:val="decimal"/>
+      <w:lvlText w:val="%1."/>
+      <w:lvlJc w:val="left"/>
+      <w:pPr>
+        <w:ind w:left="360" w:hanging="360"/>
+      </w:pPr>
+      <w:rPr>
+        <w:rFonts w:hint="default"/>
+      </w:rPr>
+    </w:lvl>
+    <w:lvl w:ilvl="1" w:tplc="04090019">
+      <w:start w:val="1"/>
+      <w:numFmt w:val="lowerLetter"/>
+      <w:lvlText w:val="%2."/>
+      <w:lvlJc w:val="left"/>
+      <w:pPr>
+        <w:ind w:left="1080" w:hanging="360"/>
+      </w:pPr>
+    </w:lvl>
+    <w:lvl w:ilvl="2" w:tplc="0409001B" w:tentative="1">
+      <w:start w:val="1"/>
+      <w:numFmt w:val="lowerRoman"/>
+      <w:lvlText w:val="%3."/>
+      <w:lvlJc w:val="right"/>
+      <w:pPr>
+        <w:ind w:left="1800" w:hanging="180"/>
+      </w:pPr>
+    </w:lvl>
+    <w:lvl w:ilvl="3" w:tplc="0409000F" w:tentative="1">
+      <w:start w:val="1"/>
+      <w:numFmt w:val="decimal"/>
+      <w:lvlText w:val="%4."/>
+      <w:lvlJc w:val="left"/>
+      <w:pPr>
+        <w:ind w:left="2520" w:hanging="360"/>
+      </w:pPr>
+    </w:lvl>
+    <w:lvl w:ilvl="4" w:tplc="04090019" w:tentative="1">
+      <w:start w:val="1"/>
+      <w:numFmt w:val="lowerLetter"/>
+      <w:lvlText w:val="%5."/>
+      <w:lvlJc w:val="left"/>
+      <w:pPr>
+        <w:ind w:left="3240" w:hanging="360"/>
+      </w:pPr>
+    </w:lvl>
+    <w:lvl w:ilvl="5" w:tplc="0409001B" w:tentative="1">
+      <w:start w:val="1"/>
+      <w:numFmt w:val="lowerRoman"/>
+      <w:lvlText w:val="%6."/>
+      <w:lvlJc w:val="right"/>
+      <w:pPr>
+        <w:ind w:left="3960" w:hanging="180"/>
+      </w:pPr>
+    </w:lvl>
+    <w:lvl w:ilvl="6" w:tplc="0409000F" w:tentative="1">
+      <w:start w:val="1"/>
+      <w:numFmt w:val="decimal"/>
+      <w:lvlText w:val="%7."/>
+      <w:lvlJc w:val="left"/>
+      <w:pPr>
+        <w:ind w:left="4680" w:hanging="360"/>
+      </w:pPr>
+    </w:lvl>
+    <w:lvl w:ilvl="7" w:tplc="04090019" w:tentative="1">
+      <w:start w:val="1"/>
+      <w:numFmt w:val="lowerLetter"/>
+      <w:lvlText w:val="%8."/>
+      <w:lvlJc w:val="left"/>
+      <w:pPr>
+        <w:ind w:left="5400" w:hanging="360"/>
+      </w:pPr>
+    </w:lvl>
+    <w:lvl w:ilvl="8" w:tplc="0409001B" w:tentative="1">
+      <w:start w:val="1"/>
+      <w:numFmt w:val="lowerRoman"/>
+      <w:lvlText w:val="%9."/>
+      <w:lvlJc w:val="right"/>
+      <w:pPr>
+        <w:ind w:left="6120" w:hanging="180"/>
+      </w:pPr>
+    </w:lvl>
+  </w:abstractNum>
+  <w:num w:numId="1" w16cid:durableId="1911424454">
+    <w:abstractNumId w:val="1"/>
+  </w:num>
+  <w:num w:numId="2" w16cid:durableId="650134587">
+    <w:abstractNumId w:val="0"/>
+  </w:num>
+</w:numbering>
 </file>
 
 <file path=word/styles.xml><?xml version="1.0" encoding="utf-8"?>
@@ -755,6 +1280,7 @@
   <w:style w:type="character" w:default="1" w:styleId="DefaultParagraphFont">
     <w:name w:val="Default Paragraph Font"/>
     <w:uiPriority w:val="1"/>
+    <w:semiHidden/>
     <w:unhideWhenUsed/>
   </w:style>
   <w:style w:type="table" w:default="1" w:styleId="TableNormal">

</xml_diff>

<commit_message>
re-projected the PPGIS data to ensure proper overlap with canopy, administrative boundaries, urban atlas layers, and the consequent grid
</commit_message>
<xml_diff>
--- a/Workflow_Explanation.docx
+++ b/Workflow_Explanation.docx
@@ -440,6 +440,40 @@
       </w:r>
       <w:r>
         <w:t>) with radius half of the intended grid cell size and square features and buffer edges</w:t>
+      </w:r>
+    </w:p>
+    <w:p>
+      <w:pPr>
+        <w:pStyle w:val="ListParagraph"/>
+        <w:numPr>
+          <w:ilvl w:val="0"/>
+          <w:numId w:val="2"/>
+        </w:numPr>
+      </w:pPr>
+      <w:r>
+        <w:t>Calculate area (</w:t>
+      </w:r>
+      <w:r>
+        <w:rPr>
+          <w:i/>
+          <w:iCs/>
+        </w:rPr>
+        <w:t>Calculator -&gt; $area</w:t>
+      </w:r>
+      <w:r>
+        <w:t>)</w:t>
+      </w:r>
+    </w:p>
+    <w:p>
+      <w:pPr>
+        <w:pStyle w:val="ListParagraph"/>
+        <w:numPr>
+          <w:ilvl w:val="0"/>
+          <w:numId w:val="2"/>
+        </w:numPr>
+      </w:pPr>
+      <w:r>
+        <w:t>Then do LC and CCSV thing</w:t>
       </w:r>
     </w:p>
     <w:p/>

</xml_diff>